<commit_message>
Sync cover letter with v5 (dual-rail power wording, sustained-operation paragraph, S1+S2); add author-info fill-in template
</commit_message>
<xml_diff>
--- a/paper/cover-letter-jrtip.docx
+++ b/paper/cover-letter-jrtip.docx
@@ -28,7 +28,7 @@
     </w:p>
     <w:p>
       <w:r>
-        <w:t>Why this work fits the journal's real-time scope. The paper does not treat real-time performance as a benchmark afterthought; the real-time constraint is the problem formulation itself. Behavior events in commercial pig barns (fighting bouts, feeding, drinking) unfold over seconds and must be captured continuously on hardware that a farm can actually deploy at scale. We therefore ask a specifically real-time question: *what accuracy can be retained, and for which behaviors, when detection must run within the latency and power envelope of a ~5 W edge board?* The answer is validated end-to-end: the full PyTorch → ONNX → TensorRT pipeline is executed on a Jetson Nano (Maxwell GPU, TensorRT 8.2), and sustained on-device latency is measured at two operating points (50.2 ms/19.7 FPS at 640×640; 30.0 ms/33.3 FPS at 480×480, ≈5 W total board power). Both points exceed the temporal resolution that behavior monitoring requires, and the 480×480 point leaves measured headroom for multi-stream deployment—an explicit latency-versus-resolution trade-off that practitioners can tune. We also document, with measurements, three deployment realities that server-side benchmarks hide: the absence of usable INT8 acceleration on Maxwell-generation boards, TensorRT operator fusion absorbing a partial-convolution speed advantage at this model scale, and toolchain failure modes with their remedies. We believe this measured, boundary-aware discussion of real-time operation is precisely what the journal's readership expects.</w:t>
+        <w:t>Why this work fits the journal's real-time scope. The paper does not treat real-time performance as a benchmark afterthought; the real-time constraint is the problem formulation itself. Behavior events in commercial pig barns (fighting bouts, feeding, drinking) unfold over seconds and must be captured continuously on hardware that a farm can actually deploy at scale. We therefore ask a specifically real-time question: *what accuracy can be retained, and for which behaviors, when detection must run within the latency and power envelope of a low-cost edge board (≈7 W sustained)?* The answer is validated end-to-end: the full PyTorch → ONNX → TensorRT pipeline is executed on a Jetson Nano (Maxwell GPU, TensorRT 8.2), and sustained on-device latency is measured at two operating points (50.2 ms/19.7 FPS at 640×640; 30.0 ms/33.3 FPS at 480×480; ≈7 W total input under sustained load, ≈5 W across the GPU and CPU rails). Both points exceed the temporal resolution that behavior monitoring requires, and the 480×480 point leaves measured headroom for multi-stream deployment—an explicit latency-versus-resolution trade-off that practitioners can tune. We also document, with measurements, three deployment realities that server-side benchmarks hide: the absence of usable INT8 acceleration on Maxwell-generation boards, TensorRT operator fusion absorbing a partial-convolution speed advantage at this model scale, and toolchain failure modes with their remedies. Sustained operation is measured, not assumed: throughput holds at 20.0 FPS over 12,000 consecutive inferences (10.7 min; 99th-percentile latency 51.3 ms; peak GPU temperature 55.5 °C) with no thermal throttling, and the latency breakdown identifies the CPU—not the GPU—as the pipeline bottleneck, so production deployments should implement pre/post-processing in C or CUDA. We believe this measured, boundary-aware discussion of real-time operation is precisely what the journal's readership expects.</w:t>
       </w:r>
     </w:p>
     <w:p>
@@ -43,7 +43,7 @@
     </w:p>
     <w:p>
       <w:r>
-        <w:t>Supplementary material. One supplementary file (Supplementary_Material.pdf/docx) accompanies the submission, containing the per-class AP50 breakdown (Table S1) referenced in Section 4.4.</w:t>
+        <w:t>Supplementary material. One supplementary file (Supplementary_Material.pdf/docx) accompanies the submission, containing the per-class AP50 breakdown (validation set, Table S1; test set, Table S2) referenced in Section 4.4.</w:t>
       </w:r>
     </w:p>
     <w:p>

</xml_diff>